<commit_message>
Update to uniform-dispersal interpolation for no-signal responsa
</commit_message>
<xml_diff>
--- a/Table2_Rishonim_Region_Regression.docx
+++ b/Table2_Rishonim_Region_Regression.docx
@@ -104,6 +104,58 @@
                 <w:b w:val="false"/>
                 <w:bCs w:val="false"/>
               </w:rPr>
+              <w:t xml:space="preserve">Italy and the Balkans</w:t>
+            </w:r>
+          </w:p>
+        </w:tc>
+        <w:tc>
+          <w:tcPr>
+            <w:tcW w:type="dxa" w:w="2600"/>
+            <w:tcMar>
+              <w:top w:type="dxa" w:w="80"/>
+              <w:left w:type="dxa" w:w="120"/>
+              <w:bottom w:type="dxa" w:w="80"/>
+              <w:right w:type="dxa" w:w="120"/>
+            </w:tcMar>
+          </w:tcPr>
+          <w:p>
+            <w:pPr>
+              <w:jc w:val="center"/>
+            </w:pPr>
+            <w:r>
+              <w:t xml:space="preserve">737.08***</w:t>
+            </w:r>
+          </w:p>
+          <w:p>
+            <w:pPr>
+              <w:jc w:val="center"/>
+            </w:pPr>
+            <w:r>
+              <w:t xml:space="preserve">(227.52)</w:t>
+            </w:r>
+          </w:p>
+        </w:tc>
+      </w:tr>
+      <w:tr>
+        <w:tc>
+          <w:tcPr>
+            <w:tcW w:type="dxa" w:w="4500"/>
+            <w:tcMar>
+              <w:top w:type="dxa" w:w="80"/>
+              <w:left w:type="dxa" w:w="120"/>
+              <w:bottom w:type="dxa" w:w="80"/>
+              <w:right w:type="dxa" w:w="120"/>
+            </w:tcMar>
+          </w:tcPr>
+          <w:p>
+            <w:pPr>
+              <w:jc w:val="left"/>
+            </w:pPr>
+            <w:r>
+              <w:rPr>
+                <w:b w:val="false"/>
+                <w:bCs w:val="false"/>
+              </w:rPr>
               <w:t xml:space="preserve">Iberia</w:t>
             </w:r>
           </w:p>
@@ -123,15 +175,15 @@
               <w:jc w:val="center"/>
             </w:pPr>
             <w:r>
-              <w:t xml:space="preserve">-28.35</w:t>
-            </w:r>
-          </w:p>
-          <w:p>
-            <w:pPr>
-              <w:jc w:val="center"/>
-            </w:pPr>
-            <w:r>
-              <w:t xml:space="preserve">(275.64)</w:t>
+              <w:t xml:space="preserve">245.93</w:t>
+            </w:r>
+          </w:p>
+          <w:p>
+            <w:pPr>
+              <w:jc w:val="center"/>
+            </w:pPr>
+            <w:r>
+              <w:t xml:space="preserve">(254.13)</w:t>
             </w:r>
           </w:p>
         </w:tc>
@@ -175,15 +227,15 @@
               <w:jc w:val="center"/>
             </w:pPr>
             <w:r>
-              <w:t xml:space="preserve">118.87</w:t>
-            </w:r>
-          </w:p>
-          <w:p>
-            <w:pPr>
-              <w:jc w:val="center"/>
-            </w:pPr>
-            <w:r>
-              <w:t xml:space="preserve">(278.13)</w:t>
+              <w:t xml:space="preserve">224.95</w:t>
+            </w:r>
+          </w:p>
+          <w:p>
+            <w:pPr>
+              <w:jc w:val="center"/>
+            </w:pPr>
+            <w:r>
+              <w:t xml:space="preserve">(257.71)</w:t>
             </w:r>
           </w:p>
         </w:tc>
@@ -208,7 +260,7 @@
                 <w:b w:val="false"/>
                 <w:bCs w:val="false"/>
               </w:rPr>
-              <w:t xml:space="preserve">Italy and the Balkans</w:t>
+              <w:t xml:space="preserve">West Asia (ex Israel)</w:t>
             </w:r>
           </w:p>
         </w:tc>
@@ -227,15 +279,15 @@
               <w:jc w:val="center"/>
             </w:pPr>
             <w:r>
-              <w:t xml:space="preserve">793.26***</w:t>
-            </w:r>
-          </w:p>
-          <w:p>
-            <w:pPr>
-              <w:jc w:val="center"/>
-            </w:pPr>
-            <w:r>
-              <w:t xml:space="preserve">(265.90)</w:t>
+              <w:t xml:space="preserve">-4.27</w:t>
+            </w:r>
+          </w:p>
+          <w:p>
+            <w:pPr>
+              <w:jc w:val="center"/>
+            </w:pPr>
+            <w:r>
+              <w:t xml:space="preserve">(149.78)</w:t>
             </w:r>
           </w:p>
         </w:tc>
@@ -252,7 +304,7 @@
           <w:sz w:val="18"/>
           <w:szCs w:val="18"/>
         </w:rPr>
-        <w:t xml:space="preserve">Note: * p &lt; 0.10, ** p &lt; 0.05, *** p &lt; 0.01. Linear regression of responsum word length on region dummy variables (North Africa omitted) and a dummy variable for each half-century in the sample. Sample: responsa written 1000-1350 CE (N = 11,463). Standard errors clustered by author.</w:t>
+        <w:t xml:space="preserve">Note: * p &lt; 0.10, ** p &lt; 0.05, *** p &lt; 0.01. Linear regression of responsum word length on region dummy variables (North Africa omitted) and a dummy variable for each half-century in the sample. Sample: responsa written 1000-1350 CE (N = 12,144). Standard errors clustered by author.</w:t>
       </w:r>
     </w:p>
     <w:sectPr>

</xml_diff>

<commit_message>
Rebuild pipeline: corpus cleaning (front matter, non-responsa Geonic works, shtarot), Maharash date fix, WL>=11 in all figures/tables; regenerate outputs
</commit_message>
<xml_diff>
--- a/Table2_Rishonim_Region_Regression.docx
+++ b/Table2_Rishonim_Region_Regression.docx
@@ -4,20 +4,21 @@
   <w:body>
     <w:p>
       <w:pPr>
-        <w:pStyle w:val="Heading3"/>
-        <w:spacing w:after="120" w:before="240"/>
+        <w:spacing w:after="160"/>
       </w:pPr>
       <w:r>
         <w:rPr>
           <w:b/>
           <w:bCs/>
+          <w:sz w:val="24"/>
+          <w:szCs w:val="24"/>
         </w:rPr>
         <w:t xml:space="preserve">Table 2: Rishonim Period Region Effects on Responsa Word Length</w:t>
       </w:r>
     </w:p>
     <w:tbl>
       <w:tblPr>
-        <w:tblW w:type="dxa" w:w="7100"/>
+        <w:tblW w:type="dxa" w:w="9600"/>
         <w:tblBorders>
           <w:top w:val="single" w:color="auto" w:sz="4"/>
           <w:left w:val="single" w:color="auto" w:sz="4"/>
@@ -28,8 +29,8 @@
         </w:tblBorders>
       </w:tblPr>
       <w:tblGrid>
-        <w:gridCol w:w="4500"/>
-        <w:gridCol w:w="2600"/>
+        <w:gridCol w:w="6800"/>
+        <w:gridCol w:w="2800"/>
       </w:tblGrid>
       <w:tr>
         <w:trPr>
@@ -37,8 +38,8 @@
         </w:trPr>
         <w:tc>
           <w:tcPr>
-            <w:tcW w:type="dxa" w:w="4500"/>
-            <w:shd w:fill="D9D9D9" w:val="clear"/>
+            <w:tcW w:type="dxa" w:w="6800"/>
+            <w:shd w:fill="D9D9D9" w:color="auto" w:val="clear"/>
             <w:tcMar>
               <w:top w:type="dxa" w:w="80"/>
               <w:left w:type="dxa" w:w="120"/>
@@ -54,6 +55,10 @@
               <w:rPr>
                 <w:b/>
                 <w:bCs/>
+                <w:i w:val="false"/>
+                <w:iCs w:val="false"/>
+                <w:sz w:val="21"/>
+                <w:szCs w:val="21"/>
               </w:rPr>
               <w:t xml:space="preserve">Region</w:t>
             </w:r>
@@ -61,8 +66,8 @@
         </w:tc>
         <w:tc>
           <w:tcPr>
-            <w:tcW w:type="dxa" w:w="2600"/>
-            <w:shd w:fill="D9D9D9" w:val="clear"/>
+            <w:tcW w:type="dxa" w:w="2800"/>
+            <w:shd w:fill="D9D9D9" w:color="auto" w:val="clear"/>
             <w:tcMar>
               <w:top w:type="dxa" w:w="80"/>
               <w:left w:type="dxa" w:w="120"/>
@@ -78,6 +83,10 @@
               <w:rPr>
                 <w:b/>
                 <w:bCs/>
+                <w:i w:val="false"/>
+                <w:iCs w:val="false"/>
+                <w:sz w:val="21"/>
+                <w:szCs w:val="21"/>
               </w:rPr>
               <w:t xml:space="preserve">Estimate (SE)</w:t>
             </w:r>
@@ -87,7 +96,7 @@
       <w:tr>
         <w:tc>
           <w:tcPr>
-            <w:tcW w:type="dxa" w:w="4500"/>
+            <w:tcW w:type="dxa" w:w="6800"/>
             <w:tcMar>
               <w:top w:type="dxa" w:w="80"/>
               <w:left w:type="dxa" w:w="120"/>
@@ -103,6 +112,10 @@
               <w:rPr>
                 <w:b w:val="false"/>
                 <w:bCs w:val="false"/>
+                <w:i w:val="false"/>
+                <w:iCs w:val="false"/>
+                <w:sz w:val="21"/>
+                <w:szCs w:val="21"/>
               </w:rPr>
               <w:t xml:space="preserve">Italy and the Balkans</w:t>
             </w:r>
@@ -110,28 +123,36 @@
         </w:tc>
         <w:tc>
           <w:tcPr>
-            <w:tcW w:type="dxa" w:w="2600"/>
-            <w:tcMar>
-              <w:top w:type="dxa" w:w="80"/>
-              <w:left w:type="dxa" w:w="120"/>
-              <w:bottom w:type="dxa" w:w="80"/>
-              <w:right w:type="dxa" w:w="120"/>
-            </w:tcMar>
-          </w:tcPr>
-          <w:p>
-            <w:pPr>
-              <w:jc w:val="center"/>
-            </w:pPr>
-            <w:r>
-              <w:t xml:space="preserve">737.08***</w:t>
-            </w:r>
-          </w:p>
-          <w:p>
-            <w:pPr>
-              <w:jc w:val="center"/>
-            </w:pPr>
-            <w:r>
-              <w:t xml:space="preserve">(227.52)</w:t>
+            <w:tcW w:type="dxa" w:w="2800"/>
+            <w:tcMar>
+              <w:top w:type="dxa" w:w="80"/>
+              <w:left w:type="dxa" w:w="120"/>
+              <w:bottom w:type="dxa" w:w="80"/>
+              <w:right w:type="dxa" w:w="120"/>
+            </w:tcMar>
+          </w:tcPr>
+          <w:p>
+            <w:pPr>
+              <w:jc w:val="center"/>
+            </w:pPr>
+            <w:r>
+              <w:rPr>
+                <w:sz w:val="21"/>
+                <w:szCs w:val="21"/>
+              </w:rPr>
+              <w:t xml:space="preserve">581.66***</w:t>
+            </w:r>
+          </w:p>
+          <w:p>
+            <w:pPr>
+              <w:jc w:val="center"/>
+            </w:pPr>
+            <w:r>
+              <w:rPr>
+                <w:sz w:val="21"/>
+                <w:szCs w:val="21"/>
+              </w:rPr>
+              <w:t xml:space="preserve">(96.01)</w:t>
             </w:r>
           </w:p>
         </w:tc>
@@ -139,7 +160,7 @@
       <w:tr>
         <w:tc>
           <w:tcPr>
-            <w:tcW w:type="dxa" w:w="4500"/>
+            <w:tcW w:type="dxa" w:w="6800"/>
             <w:tcMar>
               <w:top w:type="dxa" w:w="80"/>
               <w:left w:type="dxa" w:w="120"/>
@@ -155,6 +176,10 @@
               <w:rPr>
                 <w:b w:val="false"/>
                 <w:bCs w:val="false"/>
+                <w:i w:val="false"/>
+                <w:iCs w:val="false"/>
+                <w:sz w:val="21"/>
+                <w:szCs w:val="21"/>
               </w:rPr>
               <w:t xml:space="preserve">Iberia</w:t>
             </w:r>
@@ -162,28 +187,36 @@
         </w:tc>
         <w:tc>
           <w:tcPr>
-            <w:tcW w:type="dxa" w:w="2600"/>
-            <w:tcMar>
-              <w:top w:type="dxa" w:w="80"/>
-              <w:left w:type="dxa" w:w="120"/>
-              <w:bottom w:type="dxa" w:w="80"/>
-              <w:right w:type="dxa" w:w="120"/>
-            </w:tcMar>
-          </w:tcPr>
-          <w:p>
-            <w:pPr>
-              <w:jc w:val="center"/>
-            </w:pPr>
-            <w:r>
-              <w:t xml:space="preserve">245.93</w:t>
-            </w:r>
-          </w:p>
-          <w:p>
-            <w:pPr>
-              <w:jc w:val="center"/>
-            </w:pPr>
-            <w:r>
-              <w:t xml:space="preserve">(254.13)</w:t>
+            <w:tcW w:type="dxa" w:w="2800"/>
+            <w:tcMar>
+              <w:top w:type="dxa" w:w="80"/>
+              <w:left w:type="dxa" w:w="120"/>
+              <w:bottom w:type="dxa" w:w="80"/>
+              <w:right w:type="dxa" w:w="120"/>
+            </w:tcMar>
+          </w:tcPr>
+          <w:p>
+            <w:pPr>
+              <w:jc w:val="center"/>
+            </w:pPr>
+            <w:r>
+              <w:rPr>
+                <w:sz w:val="21"/>
+                <w:szCs w:val="21"/>
+              </w:rPr>
+              <w:t xml:space="preserve">12.80</w:t>
+            </w:r>
+          </w:p>
+          <w:p>
+            <w:pPr>
+              <w:jc w:val="center"/>
+            </w:pPr>
+            <w:r>
+              <w:rPr>
+                <w:sz w:val="21"/>
+                <w:szCs w:val="21"/>
+              </w:rPr>
+              <w:t xml:space="preserve">(80.93)</w:t>
             </w:r>
           </w:p>
         </w:tc>
@@ -191,7 +224,7 @@
       <w:tr>
         <w:tc>
           <w:tcPr>
-            <w:tcW w:type="dxa" w:w="4500"/>
+            <w:tcW w:type="dxa" w:w="6800"/>
             <w:tcMar>
               <w:top w:type="dxa" w:w="80"/>
               <w:left w:type="dxa" w:w="120"/>
@@ -207,6 +240,10 @@
               <w:rPr>
                 <w:b w:val="false"/>
                 <w:bCs w:val="false"/>
+                <w:i w:val="false"/>
+                <w:iCs w:val="false"/>
+                <w:sz w:val="21"/>
+                <w:szCs w:val="21"/>
               </w:rPr>
               <w:t xml:space="preserve">Central and Western Europe</w:t>
             </w:r>
@@ -214,28 +251,36 @@
         </w:tc>
         <w:tc>
           <w:tcPr>
-            <w:tcW w:type="dxa" w:w="2600"/>
-            <w:tcMar>
-              <w:top w:type="dxa" w:w="80"/>
-              <w:left w:type="dxa" w:w="120"/>
-              <w:bottom w:type="dxa" w:w="80"/>
-              <w:right w:type="dxa" w:w="120"/>
-            </w:tcMar>
-          </w:tcPr>
-          <w:p>
-            <w:pPr>
-              <w:jc w:val="center"/>
-            </w:pPr>
-            <w:r>
-              <w:t xml:space="preserve">224.95</w:t>
-            </w:r>
-          </w:p>
-          <w:p>
-            <w:pPr>
-              <w:jc w:val="center"/>
-            </w:pPr>
-            <w:r>
-              <w:t xml:space="preserve">(257.71)</w:t>
+            <w:tcW w:type="dxa" w:w="2800"/>
+            <w:tcMar>
+              <w:top w:type="dxa" w:w="80"/>
+              <w:left w:type="dxa" w:w="120"/>
+              <w:bottom w:type="dxa" w:w="80"/>
+              <w:right w:type="dxa" w:w="120"/>
+            </w:tcMar>
+          </w:tcPr>
+          <w:p>
+            <w:pPr>
+              <w:jc w:val="center"/>
+            </w:pPr>
+            <w:r>
+              <w:rPr>
+                <w:sz w:val="21"/>
+                <w:szCs w:val="21"/>
+              </w:rPr>
+              <w:t xml:space="preserve">-11.26</w:t>
+            </w:r>
+          </w:p>
+          <w:p>
+            <w:pPr>
+              <w:jc w:val="center"/>
+            </w:pPr>
+            <w:r>
+              <w:rPr>
+                <w:sz w:val="21"/>
+                <w:szCs w:val="21"/>
+              </w:rPr>
+              <w:t xml:space="preserve">(74.66)</w:t>
             </w:r>
           </w:p>
         </w:tc>
@@ -243,7 +288,7 @@
       <w:tr>
         <w:tc>
           <w:tcPr>
-            <w:tcW w:type="dxa" w:w="4500"/>
+            <w:tcW w:type="dxa" w:w="6800"/>
             <w:tcMar>
               <w:top w:type="dxa" w:w="80"/>
               <w:left w:type="dxa" w:w="120"/>
@@ -259,6 +304,10 @@
               <w:rPr>
                 <w:b w:val="false"/>
                 <w:bCs w:val="false"/>
+                <w:i w:val="false"/>
+                <w:iCs w:val="false"/>
+                <w:sz w:val="21"/>
+                <w:szCs w:val="21"/>
               </w:rPr>
               <w:t xml:space="preserve">West Asia (ex Israel)</w:t>
             </w:r>
@@ -266,28 +315,36 @@
         </w:tc>
         <w:tc>
           <w:tcPr>
-            <w:tcW w:type="dxa" w:w="2600"/>
-            <w:tcMar>
-              <w:top w:type="dxa" w:w="80"/>
-              <w:left w:type="dxa" w:w="120"/>
-              <w:bottom w:type="dxa" w:w="80"/>
-              <w:right w:type="dxa" w:w="120"/>
-            </w:tcMar>
-          </w:tcPr>
-          <w:p>
-            <w:pPr>
-              <w:jc w:val="center"/>
-            </w:pPr>
-            <w:r>
-              <w:t xml:space="preserve">-4.27</w:t>
-            </w:r>
-          </w:p>
-          <w:p>
-            <w:pPr>
-              <w:jc w:val="center"/>
-            </w:pPr>
-            <w:r>
-              <w:t xml:space="preserve">(149.78)</w:t>
+            <w:tcW w:type="dxa" w:w="2800"/>
+            <w:tcMar>
+              <w:top w:type="dxa" w:w="80"/>
+              <w:left w:type="dxa" w:w="120"/>
+              <w:bottom w:type="dxa" w:w="80"/>
+              <w:right w:type="dxa" w:w="120"/>
+            </w:tcMar>
+          </w:tcPr>
+          <w:p>
+            <w:pPr>
+              <w:jc w:val="center"/>
+            </w:pPr>
+            <w:r>
+              <w:rPr>
+                <w:sz w:val="21"/>
+                <w:szCs w:val="21"/>
+              </w:rPr>
+              <w:t xml:space="preserve">-114.28</w:t>
+            </w:r>
+          </w:p>
+          <w:p>
+            <w:pPr>
+              <w:jc w:val="center"/>
+            </w:pPr>
+            <w:r>
+              <w:rPr>
+                <w:sz w:val="21"/>
+                <w:szCs w:val="21"/>
+              </w:rPr>
+              <w:t xml:space="preserve">(70.51)</w:t>
             </w:r>
           </w:p>
         </w:tc>
@@ -295,16 +352,16 @@
     </w:tbl>
     <w:p>
       <w:pPr>
-        <w:spacing w:before="120"/>
+        <w:spacing w:before="160"/>
       </w:pPr>
       <w:r>
         <w:rPr>
           <w:i/>
           <w:iCs/>
-          <w:sz w:val="18"/>
-          <w:szCs w:val="18"/>
+          <w:sz w:val="19"/>
+          <w:szCs w:val="19"/>
         </w:rPr>
-        <w:t xml:space="preserve">Note: * p &lt; 0.10, ** p &lt; 0.05, *** p &lt; 0.01. Linear regression of responsum word length on region dummy variables (North Africa omitted) and a dummy variable for each half-century in the sample. Sample: responsa written 1000-1350 CE (N = 12,144). Standard errors clustered by author.</w:t>
+        <w:t xml:space="preserve">Note: * p &lt; 0.10, ** p &lt; 0.05, *** p &lt; 0.01. Linear regression of responsum word length on region dummy variables (North Africa omitted) and a dummy variable for each half-century in the sample. Sample: responsa written 1000-1350 CE (N = 12,000). Standard errors clustered by author.</w:t>
       </w:r>
     </w:p>
     <w:sectPr>

</xml_diff>